<commit_message>
Restore original established forms across packages; preserve registers and block pending native Office QA
</commit_message>
<xml_diff>
--- a/tools/candidates/remaining-batch-r3-20261018/checkpoint-working/P1/00-INSTRUKCIYA.docx
+++ b/tools/candidates/remaining-batch-r3-20261018/checkpoint-working/P1/00-INSTRUKCIYA.docx
@@ -476,7 +476,7 @@
                 <w:rFonts w:ascii="Arial" w:hAnsi="Arial"/>
                 <w:sz w:val="18"/>
               </w:rPr>
-              <w:t>06-zhurnal-obemov.xlsx</w:t>
+              <w:t>06-zhurnal-ucheta-rabot-ks-6a.xls</w:t>
             </w:r>
           </w:p>
         </w:tc>
@@ -493,7 +493,7 @@
                 <w:rFonts w:ascii="Arial" w:hAnsi="Arial"/>
                 <w:sz w:val="18"/>
               </w:rPr>
-              <w:t>Для фиксации выполненных объёмов</w:t>
+              <w:t>Для учёта выполненных работ</w:t>
             </w:r>
           </w:p>
         </w:tc>
@@ -510,7 +510,63 @@
                 <w:rFonts w:ascii="Arial" w:hAnsi="Arial"/>
                 <w:sz w:val="18"/>
               </w:rPr>
-              <w:t>Журнал и ссылки на доказательства</w:t>
+              <w:t>Журнал по форме КС-6а</w:t>
+            </w:r>
+          </w:p>
+        </w:tc>
+      </w:tr>
+      <w:tr>
+        <w:trPr>
+          <w:cantSplit/>
+        </w:trPr>
+        <w:tc>
+          <w:tcPr>
+            <w:tcW w:type="dxa" w:w="3009"/>
+          </w:tcPr>
+          <w:p>
+            <w:pPr>
+              <w:spacing w:after="0"/>
+            </w:pPr>
+            <w:r>
+              <w:rPr>
+                <w:rFonts w:ascii="Arial" w:hAnsi="Arial"/>
+                <w:sz w:val="18"/>
+              </w:rPr>
+              <w:t>06A-rabochiy-reestr-obemov.xlsx</w:t>
+            </w:r>
+          </w:p>
+        </w:tc>
+        <w:tc>
+          <w:tcPr>
+            <w:tcW w:type="dxa" w:w="3009"/>
+          </w:tcPr>
+          <w:p>
+            <w:pPr>
+              <w:spacing w:after="0"/>
+            </w:pPr>
+            <w:r>
+              <w:rPr>
+                <w:rFonts w:ascii="Arial" w:hAnsi="Arial"/>
+                <w:sz w:val="18"/>
+              </w:rPr>
+              <w:t>Для оперативного учёта объёмов</w:t>
+            </w:r>
+          </w:p>
+        </w:tc>
+        <w:tc>
+          <w:tcPr>
+            <w:tcW w:type="dxa" w:w="3009"/>
+          </w:tcPr>
+          <w:p>
+            <w:pPr>
+              <w:spacing w:after="0"/>
+            </w:pPr>
+            <w:r>
+              <w:rPr>
+                <w:rFonts w:ascii="Arial" w:hAnsi="Arial"/>
+                <w:sz w:val="18"/>
+              </w:rPr>
+              <w:t>Записи и ссылки на подтверждения</w:t>
             </w:r>
           </w:p>
         </w:tc>
@@ -1174,7 +1230,7 @@
         <w:rPr>
           <w:rFonts w:ascii="Arial" w:hAnsi="Arial"/>
         </w:rPr>
-        <w:t>По каждому предъявляемому объёму должны быть определены основание выполнения, подтверждающие документы, согласованная стоимость, дата передачи и договорный срок оплаты. В журнале 06 фиксируются объёмы, в реестре 07 — замечания и их устранение, в реестре 08 — передача документов. Остаток к оплате сверяется с банковскими выписками до расчёта процентов в файле 14.</w:t>
+        <w:t>По каждому предъявляемому объёму проверьте основание, подтверждающие документы, стоимость, дату передачи и срок оплаты. Форма КС-6а — файл 06; оперативный учёт объёмов и подтверждений — 06A. Реестр 07 содержит замечания, реестр 08 — передачу документов. До расчёта процентов в файле 14 сверьте остаток с банковскими выписками.</w:t>
       </w:r>
     </w:p>
     <w:p>
@@ -1198,7 +1254,7 @@
         <w:rPr>
           <w:rFonts w:ascii="Arial" w:hAnsi="Arial"/>
         </w:rPr>
-        <w:t>Файлы 01-ks-2.xls и 02-ks-3.xls содержат опубликованные бланки унифицированных форм № КС-2 и № КС-3, утверждённых постановлением Госкомстата России от 11.11.1999 № 100. Бланки сохранены без изменения текста, граф и оформления. Заполните их в Excel по документам объекта и проверьте применимость в соответствии с договором и учётной политикой.</w:t>
+        <w:t>Файлы 01-ks-2.xls, 02-ks-3.xls и 06-zhurnal-ucheta-rabot-ks-6a.xls — опубликованные бланки КС-2, КС-3 и КС-6а по постановлению Госкомстата России от 11.11.1999 № 100. Текст, графы и оформление сохранены. Заполните их в Excel по документам объекта; применимость проверьте по договору и учётной политике.</w:t>
       </w:r>
     </w:p>
     <w:p>
@@ -1220,7 +1276,7 @@
         <w:rPr>
           <w:rFonts w:ascii="Arial" w:hAnsi="Arial"/>
         </w:rPr>
-        <w:t>Файл 06 предназначен для оперативного учёта объёмов и подтверждающих документов. Если договором предусмотрены КС-6а или иной журнал, ведите соответствующую форму дополнительно. Источник бланков КС-2 и КС-3: https://www.consultant.ru/document/cons_doc_LAW_26303/ .</w:t>
+        <w:t>Файл 06A предназначен для оперативного учёта объёмов и подтверждений. Форму КС-6а заполняйте в файле 06 по документам объекта. Источник бланков КС-2, КС-3 и КС-6а: https://www.consultant.ru/document/cons_doc_LAW_26303/ .</w:t>
       </w:r>
     </w:p>
     <w:sectPr>

</xml_diff>